<commit_message>
Clustr no longer an internship.
</commit_message>
<xml_diff>
--- a/Master_Resume.docx
+++ b/Master_Resume.docx
@@ -120,7 +120,7 @@
           <w:sz w:val="20"/>
           <w:szCs w:val="20"/>
         </w:rPr>
-        <w:t>Expected Graduation: May 2027</w:t>
+        <w:t>Expected Graduation: Dec 2027</w:t>
       </w:r>
     </w:p>
     <w:p>
@@ -213,7 +213,7 @@
           <w:sz w:val="20"/>
           <w:szCs w:val="20"/>
         </w:rPr>
-        <w:t>Software Engineering Intern — Clustr</w:t>
+        <w:t>Software Engineering Intern — Prenora Dynamics LLC</w:t>
       </w:r>
       <w:r>
         <w:rPr/>
@@ -227,116 +227,7 @@
           <w:sz w:val="20"/>
           <w:szCs w:val="20"/>
         </w:rPr>
-        <w:t>Jan 2026 – Sept 2026 (expected)</w:t>
-      </w:r>
-    </w:p>
-    <w:p>
-      <w:pPr>
-        <w:pStyle w:val="Normal"/>
-        <w:spacing w:before="0" w:after="40"/>
-        <w:rPr/>
-      </w:pPr>
-      <w:r>
-        <w:rPr>
-          <w:rFonts w:eastAsia="Calibri" w:cs="Calibri" w:ascii="Calibri" w:hAnsi="Calibri"/>
-          <w:i/>
-          <w:iCs/>
-          <w:sz w:val="20"/>
-          <w:szCs w:val="20"/>
-        </w:rPr>
-        <w:t>Cross-platform React Native social/scheduling app  |  ~8-person dev team</w:t>
-      </w:r>
-    </w:p>
-    <w:p>
-      <w:pPr>
-        <w:pStyle w:val="ListParagraph"/>
-        <w:numPr>
-          <w:ilvl w:val="0"/>
-          <w:numId w:val="4"/>
-        </w:numPr>
-        <w:spacing w:before="0" w:after="60"/>
-        <w:rPr/>
-      </w:pPr>
-      <w:r>
-        <w:rPr>
-          <w:rFonts w:eastAsia="Calibri" w:cs="Calibri" w:ascii="Calibri" w:hAnsi="Calibri"/>
-          <w:sz w:val="20"/>
-          <w:szCs w:val="20"/>
-        </w:rPr>
-        <w:t>Built server-side community infrastructure using Firebase Cloud Functions, including CRUD operations for communities, posts, and comments with enforced ban/edit permissions to prevent client-side database tampering, plus join/leave workflows, like/dislike interactions, and activity feed endpoints.</w:t>
-      </w:r>
-    </w:p>
-    <w:p>
-      <w:pPr>
-        <w:pStyle w:val="ListParagraph"/>
-        <w:numPr>
-          <w:ilvl w:val="0"/>
-          <w:numId w:val="2"/>
-        </w:numPr>
-        <w:spacing w:before="0" w:after="60"/>
-        <w:rPr/>
-      </w:pPr>
-      <w:r>
-        <w:rPr>
-          <w:rFonts w:eastAsia="Calibri" w:cs="Calibri" w:ascii="Calibri" w:hAnsi="Calibri"/>
-          <w:sz w:val="20"/>
-          <w:szCs w:val="20"/>
-        </w:rPr>
-        <w:t>Designed and implemented a Scheduler UI module featuring tabbed navigation (Suggestions, Requests, Responses), a reschedule bottom sheet, custom date/time picker integration, and a calendar-completion animation to improve user engagement.</w:t>
-      </w:r>
-    </w:p>
-    <w:p>
-      <w:pPr>
-        <w:pStyle w:val="ListParagraph"/>
-        <w:numPr>
-          <w:ilvl w:val="0"/>
-          <w:numId w:val="2"/>
-        </w:numPr>
-        <w:spacing w:before="0" w:after="60"/>
-        <w:rPr/>
-      </w:pPr>
-      <w:r>
-        <w:rPr>
-          <w:rFonts w:eastAsia="Calibri" w:cs="Calibri" w:ascii="Calibri" w:hAnsi="Calibri"/>
-          <w:sz w:val="20"/>
-          <w:szCs w:val="20"/>
-        </w:rPr>
-        <w:t>Implemented secure authentication features, including a password reset flow (client screen plus backend cloud function) and custom claims to drive new-user onboarding logic.</w:t>
-      </w:r>
-    </w:p>
-    <w:p>
-      <w:pPr>
-        <w:pStyle w:val="Normal"/>
-        <w:tabs>
-          <w:tab w:val="clear" w:pos="720"/>
-          <w:tab w:val="right" w:pos="9026" w:leader="none"/>
-        </w:tabs>
-        <w:spacing w:before="140" w:after="20"/>
-        <w:rPr/>
-      </w:pPr>
-      <w:r>
-        <w:rPr>
-          <w:rFonts w:eastAsia="Calibri" w:cs="Calibri" w:ascii="Calibri" w:hAnsi="Calibri"/>
-          <w:b/>
-          <w:bCs/>
-          <w:sz w:val="20"/>
-          <w:szCs w:val="20"/>
-        </w:rPr>
-        <w:t>Software Engineering Intern — Prenora Dynamics LLC</w:t>
-      </w:r>
-      <w:r>
-        <w:rPr/>
-        <w:tab/>
-      </w:r>
-      <w:r>
-        <w:rPr>
-          <w:rFonts w:eastAsia="Calibri" w:cs="Calibri" w:ascii="Calibri" w:hAnsi="Calibri"/>
-          <w:i/>
-          <w:iCs/>
-          <w:sz w:val="20"/>
-          <w:szCs w:val="20"/>
-        </w:rPr>
-        <w:t>Jun 2026 – Sept 2026 (expected)</w:t>
+        <w:t>Jun 2026 – Nov 2026</w:t>
       </w:r>
     </w:p>
     <w:p>
@@ -575,7 +466,7 @@
           <w:sz w:val="20"/>
           <w:szCs w:val="20"/>
         </w:rPr>
-        <w:t>Starting Fall 2026</w:t>
+        <w:t>Aug 2026 – Present</w:t>
       </w:r>
     </w:p>
     <w:p>
@@ -611,7 +502,7 @@
           <w:sz w:val="20"/>
           <w:szCs w:val="20"/>
         </w:rPr>
-        <w:t>Joining the simulations sub-team of a Vertically Integrated Project studying automotive ethics, expected to build and analyze driving/traffic scenario simulations.</w:t>
+        <w:t>Build and analyze driving and traffic scenario simulations as part of the simulations sub-team of a multi-semester Vertically Integrated Project studying automotive ethics.</w:t>
       </w:r>
     </w:p>
     <w:p>
@@ -957,6 +848,105 @@
           <w:szCs w:val="22"/>
         </w:rPr>
         <w:t>PROJECTS</w:t>
+      </w:r>
+    </w:p>
+    <w:p>
+      <w:pPr>
+        <w:pStyle w:val="Normal"/>
+        <w:tabs>
+          <w:tab w:val="clear" w:pos="720"/>
+          <w:tab w:val="right" w:pos="9026" w:leader="none"/>
+        </w:tabs>
+        <w:spacing w:before="140" w:after="20"/>
+        <w:rPr/>
+      </w:pPr>
+      <w:r>
+        <w:rPr>
+          <w:rFonts w:eastAsia="Calibri" w:cs="Calibri" w:ascii="Calibri" w:hAnsi="Calibri"/>
+          <w:b/>
+          <w:bCs/>
+          <w:sz w:val="20"/>
+          <w:szCs w:val="20"/>
+        </w:rPr>
+        <w:t>Clustr (React Native, Firebase Cloud Functions)</w:t>
+      </w:r>
+      <w:r>
+        <w:rPr/>
+        <w:tab/>
+      </w:r>
+    </w:p>
+    <w:p>
+      <w:pPr>
+        <w:pStyle w:val="Normal"/>
+        <w:spacing w:before="0" w:after="40"/>
+        <w:rPr/>
+      </w:pPr>
+      <w:r>
+        <w:rPr>
+          <w:rFonts w:eastAsia="Calibri" w:cs="Calibri" w:ascii="Calibri" w:hAnsi="Calibri"/>
+          <w:i/>
+          <w:iCs/>
+          <w:sz w:val="20"/>
+          <w:szCs w:val="20"/>
+        </w:rPr>
+        <w:t>Cross-platform React Native social/scheduling app  |  ~8-person dev team</w:t>
+      </w:r>
+    </w:p>
+    <w:p>
+      <w:pPr>
+        <w:pStyle w:val="ListParagraph"/>
+        <w:numPr>
+          <w:ilvl w:val="0"/>
+          <w:numId w:val="4"/>
+        </w:numPr>
+        <w:spacing w:before="0" w:after="60"/>
+        <w:rPr/>
+      </w:pPr>
+      <w:r>
+        <w:rPr>
+          <w:rFonts w:eastAsia="Calibri" w:cs="Calibri" w:ascii="Calibri" w:hAnsi="Calibri"/>
+          <w:sz w:val="20"/>
+          <w:szCs w:val="20"/>
+        </w:rPr>
+        <w:t>Built server-side community infrastructure using Firebase Cloud Functions, including CRUD operations for communities, posts, and comments with enforced ban/edit permissions to prevent client-side database tampering, plus join/leave workflows, like/dislike interactions, and activity feed endpoints.</w:t>
+      </w:r>
+    </w:p>
+    <w:p>
+      <w:pPr>
+        <w:pStyle w:val="ListParagraph"/>
+        <w:numPr>
+          <w:ilvl w:val="0"/>
+          <w:numId w:val="2"/>
+        </w:numPr>
+        <w:spacing w:before="0" w:after="60"/>
+        <w:rPr/>
+      </w:pPr>
+      <w:r>
+        <w:rPr>
+          <w:rFonts w:eastAsia="Calibri" w:cs="Calibri" w:ascii="Calibri" w:hAnsi="Calibri"/>
+          <w:sz w:val="20"/>
+          <w:szCs w:val="20"/>
+        </w:rPr>
+        <w:t>Designed and implemented a Scheduler UI module featuring tabbed navigation (Suggestions, Requests, Responses), a reschedule bottom sheet, custom date/time picker integration, and a calendar-completion animation to improve user engagement.</w:t>
+      </w:r>
+    </w:p>
+    <w:p>
+      <w:pPr>
+        <w:pStyle w:val="ListParagraph"/>
+        <w:numPr>
+          <w:ilvl w:val="0"/>
+          <w:numId w:val="2"/>
+        </w:numPr>
+        <w:spacing w:before="0" w:after="60"/>
+        <w:rPr/>
+      </w:pPr>
+      <w:r>
+        <w:rPr>
+          <w:rFonts w:eastAsia="Calibri" w:cs="Calibri" w:ascii="Calibri" w:hAnsi="Calibri"/>
+          <w:sz w:val="20"/>
+          <w:szCs w:val="20"/>
+        </w:rPr>
+        <w:t>Implemented secure authentication features, including a password reset flow (client screen plus backend cloud function) and custom claims to drive new-user onboarding logic.</w:t>
       </w:r>
     </w:p>
     <w:p>

</xml_diff>